<commit_message>
feat: add institution-scoped teacher workspace
</commit_message>
<xml_diff>
--- a/docs/official/EduNexus-Especificacion-tecnica-y-funcional.docx
+++ b/docs/official/EduNexus-Especificacion-tecnica-y-funcional.docx
@@ -136,16 +136,8 @@
             </w:tcMar>
           </w:tcPr>
           <w:p>
-            <w:pPr>
-              <w:spacing w:after="20"/>
-            </w:pPr>
-            <w:r/>
             <w:r>
-              <w:rPr>
-                <w:b w:val="0"/>
-                <w:sz w:val="18"/>
-              </w:rPr>
-              <w:t>1.0</w:t>
+              <w:t>1.2</w:t>
             </w:r>
           </w:p>
         </w:tc>
@@ -335,7 +327,7 @@
     </w:p>
     <w:p>
       <w:r>
-        <w:t>EduNexus es una plataforma web para organizar procesos académicos, comunicación de la comunidad educativa y gestión institucional. Esta especificación explica la arquitectura del sistema, sus principales capacidades, los perfiles de usuario, el flujo de datos y las integraciones externas observables en el repositorio.</w:t>
+        <w:t>EduNexus es una plataforma web multiinstitucional para organizar procesos académicos, comunicación de la comunidad educativa y gestión escolar. Cada cuenta pertenece a una institución y las consultas de cursos, grupos, matrículas, reportes y configuración deben respetar ese ámbito. Esta especificación explica la arquitectura, capacidades, perfiles, flujo de datos e integraciones observables en el repositorio.</w:t>
       </w:r>
     </w:p>
     <w:p>
@@ -2240,6 +2232,59 @@
           </w:p>
         </w:tc>
       </w:tr>
+      <w:tr>
+        <w:tc>
+          <w:tcPr>
+            <w:tcW w:type="dxa" w:w="3331"/>
+            <w:vAlign w:val="center"/>
+            <w:shd w:fill="F0F4F7"/>
+          </w:tcPr>
+          <w:p>
+            <w:pPr>
+              <w:spacing w:after="20"/>
+            </w:pPr>
+            <w:r>
+              <w:rPr>
+                <w:sz w:val="18"/>
+              </w:rPr>
+              <w:t>Panel de trabajo docente</w:t>
+            </w:r>
+          </w:p>
+        </w:tc>
+        <w:tc>
+          <w:tcPr>
+            <w:tcW w:type="dxa" w:w="3331"/>
+            <w:vAlign w:val="center"/>
+            <w:shd w:fill="F0F4F7"/>
+          </w:tcPr>
+          <w:p>
+            <w:pPr>
+              <w:spacing w:after="20"/>
+            </w:pPr>
+            <w:r>
+              <w:rPr>
+                <w:sz w:val="18"/>
+              </w:rPr>
+              <w:t>Resumen de aulas activas y entregas pendientes de revisión con accesos directos al curso y a la revisión.</w:t>
+            </w:r>
+          </w:p>
+        </w:tc>
+        <w:tc>
+          <w:tcPr>
+            <w:tcW w:type="dxa" w:w="3331"/>
+            <w:vAlign w:val="center"/>
+            <w:shd w:fill="F0F4F7"/>
+          </w:tcPr>
+          <w:p>
+            <w:r>
+              <w:rPr>
+                <w:sz w:val="18"/>
+              </w:rPr>
+              <w:t>Usa /api/teacher/workspace, que calcula totales completos y devuelve hasta cuatro aulas. El servidor filtra por el docente autenticado y la institución de su cuenta.</w:t>
+            </w:r>
+          </w:p>
+        </w:tc>
+      </w:tr>
     </w:tbl>
     <w:p>
       <w:pPr>
@@ -3572,6 +3617,106 @@
           </w:p>
         </w:tc>
       </w:tr>
+      <w:tr>
+        <w:tc>
+          <w:tcPr>
+            <w:tcW w:type="dxa" w:w="3331"/>
+          </w:tcPr>
+          <w:p>
+            <w:pPr>
+              <w:spacing w:after="20"/>
+            </w:pPr>
+            <w:r>
+              <w:rPr>
+                <w:sz w:val="18"/>
+              </w:rPr>
+              <w:t>21 de octubre de 2026</w:t>
+            </w:r>
+          </w:p>
+        </w:tc>
+        <w:tc>
+          <w:tcPr>
+            <w:tcW w:type="dxa" w:w="3331"/>
+          </w:tcPr>
+          <w:p>
+            <w:pPr>
+              <w:spacing w:after="20"/>
+            </w:pPr>
+            <w:r>
+              <w:rPr>
+                <w:sz w:val="18"/>
+              </w:rPr>
+              <w:t>1.1</w:t>
+            </w:r>
+          </w:p>
+        </w:tc>
+        <w:tc>
+          <w:tcPr>
+            <w:tcW w:type="dxa" w:w="3331"/>
+          </w:tcPr>
+          <w:p>
+            <w:pPr>
+              <w:spacing w:after="20"/>
+            </w:pPr>
+            <w:r>
+              <w:rPr>
+                <w:sz w:val="18"/>
+              </w:rPr>
+              <w:t>Se añadió el panel docente con conteo de aulas activas y entregas por revisar. Las consultas se identifican por usuario e institución y consumen endpoints que filtran por la institución asociada a la cuenta.</w:t>
+            </w:r>
+          </w:p>
+        </w:tc>
+      </w:tr>
+      <w:tr>
+        <w:tc>
+          <w:tcPr>
+            <w:tcW w:type="dxa" w:w="3331"/>
+          </w:tcPr>
+          <w:p>
+            <w:pPr>
+              <w:spacing w:after="20"/>
+            </w:pPr>
+            <w:r>
+              <w:rPr>
+                <w:sz w:val="18"/>
+              </w:rPr>
+              <w:t>21 de octubre de 2026</w:t>
+            </w:r>
+          </w:p>
+        </w:tc>
+        <w:tc>
+          <w:tcPr>
+            <w:tcW w:type="dxa" w:w="3331"/>
+          </w:tcPr>
+          <w:p>
+            <w:pPr>
+              <w:spacing w:after="20"/>
+            </w:pPr>
+            <w:r>
+              <w:rPr>
+                <w:sz w:val="18"/>
+              </w:rPr>
+              <w:t>1.2</w:t>
+            </w:r>
+          </w:p>
+        </w:tc>
+        <w:tc>
+          <w:tcPr>
+            <w:tcW w:type="dxa" w:w="3331"/>
+          </w:tcPr>
+          <w:p>
+            <w:pPr>
+              <w:spacing w:after="20"/>
+            </w:pPr>
+            <w:r>
+              <w:rPr>
+                <w:sz w:val="18"/>
+              </w:rPr>
+              <w:t>El panel docente utiliza el endpoint institucional /api/teacher/workspace para calcular el total de aulas activas y entregas por revisar sin depender de un listado limitado. La respuesta incluye hasta cuatro aulas para acceso rápido.</w:t>
+            </w:r>
+          </w:p>
+        </w:tc>
+      </w:tr>
     </w:tbl>
     <w:p>
       <w:pPr>
@@ -3603,7 +3748,7 @@
       <w:jc w:val="right"/>
     </w:pPr>
     <w:r>
-      <w:t xml:space="preserve">Documento vivo · Versión 1.0 · 21 de octubre de 2026  |  Página </w:t>
+      <w:t xml:space="preserve">Documento vivo · Versión 1.2 · 21 de octubre de 2026  |  Página </w:t>
     </w:r>
     <w:fldSimple w:instr="PAGE"/>
   </w:p>

</xml_diff>

<commit_message>
feat: add annual promotion review workflow
</commit_message>
<xml_diff>
--- a/docs/official/EduNexus-Especificacion-tecnica-y-funcional.docx
+++ b/docs/official/EduNexus-Especificacion-tecnica-y-funcional.docx
@@ -137,7 +137,7 @@
           </w:tcPr>
           <w:p>
             <w:r>
-              <w:t>1.2</w:t>
+              <w:t>1.3</w:t>
             </w:r>
           </w:p>
         </w:tc>
@@ -185,15 +185,7 @@
             </w:tcMar>
           </w:tcPr>
           <w:p>
-            <w:pPr>
-              <w:spacing w:after="20"/>
-            </w:pPr>
-            <w:r/>
             <w:r>
-              <w:rPr>
-                <w:b w:val="0"/>
-                <w:sz w:val="18"/>
-              </w:rPr>
               <w:t>21 de octubre de 2026</w:t>
             </w:r>
           </w:p>
@@ -569,16 +561,8 @@
             </w:tcMar>
           </w:tcPr>
           <w:p>
-            <w:pPr>
-              <w:spacing w:after="20"/>
-            </w:pPr>
-            <w:r/>
             <w:r>
-              <w:rPr>
-                <w:b w:val="0"/>
-                <w:sz w:val="18"/>
-              </w:rPr>
-              <w:t>Gestionar sus aulas, publicar contenido, revisar entregas y comunicarse con estudiantes.</w:t>
+              <w:t>Gestionar sus aulas, publicar contenido, revisar entregas, recomendar promoción anual de estudiantes de sus grupos y comunicarse con la comunidad.</w:t>
             </w:r>
           </w:p>
         </w:tc>
@@ -595,16 +579,8 @@
             </w:tcMar>
           </w:tcPr>
           <w:p>
-            <w:pPr>
-              <w:spacing w:after="20"/>
-            </w:pPr>
-            <w:r/>
             <w:r>
-              <w:rPr>
-                <w:b w:val="0"/>
-                <w:sz w:val="18"/>
-              </w:rPr>
-              <w:t>Inicio, Mis Aulas, Revisar entregas, Horarios, Grupos, Mensajes, Biblioteca, Meet, Asesorías y Calendario.</w:t>
+              <w:t>Inicio, Mis Aulas, Revisar entregas, Promoción anual, Horarios, Grupos, Mensajes, Biblioteca, Meet, Asesorías y Calendario.</w:t>
             </w:r>
           </w:p>
         </w:tc>
@@ -2285,6 +2261,38 @@
           </w:p>
         </w:tc>
       </w:tr>
+      <w:tr>
+        <w:tc>
+          <w:tcPr>
+            <w:tcW w:type="dxa" w:w="3331"/>
+          </w:tcPr>
+          <w:p>
+            <w:r>
+              <w:t>Promoción anual</w:t>
+            </w:r>
+          </w:p>
+        </w:tc>
+        <w:tc>
+          <w:tcPr>
+            <w:tcW w:type="dxa" w:w="3331"/>
+          </w:tcPr>
+          <w:p>
+            <w:r>
+              <w:t>Expediente de cierre por estudiante con calificaciones, asistencia, observaciones de convivencia, compromisos y recomendaciones justificadas de cada docente asignado. Dirección registra promover, mantener o aplazar el caso; no se calculan aprobaciones automáticas por promedio.</w:t>
+            </w:r>
+          </w:p>
+        </w:tc>
+        <w:tc>
+          <w:tcPr>
+            <w:tcW w:type="dxa" w:w="3331"/>
+          </w:tcPr>
+          <w:p>
+            <w:r>
+              <w:t>La fecha de inicio del año académico destino abre la revisión. El docente solo consulta estudiantes a quienes enseñó mediante asignación de grupo, curso virtual del grupo o inscripción individual al curso, y sus designaciones como director de grupo. Para una decisión final se exige consenso docente unánime; el directivo selecciona un grupo de la misma institución y el sistema valida el grado. La matrícula destino y el cierre de origen se guardan en una transacción.</w:t>
+            </w:r>
+          </w:p>
+        </w:tc>
+      </w:tr>
     </w:tbl>
     <w:p>
       <w:pPr>
@@ -3717,6 +3725,38 @@
           </w:p>
         </w:tc>
       </w:tr>
+      <w:tr>
+        <w:tc>
+          <w:tcPr>
+            <w:tcW w:type="dxa" w:w="3331"/>
+          </w:tcPr>
+          <w:p>
+            <w:r>
+              <w:t>21 de octubre de 2026</w:t>
+            </w:r>
+          </w:p>
+        </w:tc>
+        <w:tc>
+          <w:tcPr>
+            <w:tcW w:type="dxa" w:w="3331"/>
+          </w:tcPr>
+          <w:p>
+            <w:r>
+              <w:t>1.3</w:t>
+            </w:r>
+          </w:p>
+        </w:tc>
+        <w:tc>
+          <w:tcPr>
+            <w:tcW w:type="dxa" w:w="3331"/>
+          </w:tcPr>
+          <w:p>
+            <w:r>
+              <w:t>Se incorporó la revisión anual de promoción multiinstitucional: fecha de apertura configurable por año destino, evidencia académica y de convivencia, recomendación justificada de todos los docentes, consenso obligatorio, resolución directiva y matrícula destino transaccional. Se documentó el historial en student_promotion_reviews y student_promotion_decisions.</w:t>
+            </w:r>
+          </w:p>
+        </w:tc>
+      </w:tr>
     </w:tbl>
     <w:p>
       <w:pPr>

</xml_diff>

<commit_message>
feat: show full activity submission tracking
</commit_message>
<xml_diff>
--- a/docs/official/EduNexus-Especificacion-tecnica-y-funcional.docx
+++ b/docs/official/EduNexus-Especificacion-tecnica-y-funcional.docx
@@ -137,7 +137,7 @@
           </w:tcPr>
           <w:p>
             <w:r>
-              <w:t>1.3</w:t>
+              <w:t>1.4</w:t>
             </w:r>
           </w:p>
         </w:tc>
@@ -186,7 +186,7 @@
           </w:tcPr>
           <w:p>
             <w:r>
-              <w:t>21 de octubre de 2026</w:t>
+              <w:t>22 de octubre de 2026</w:t>
             </w:r>
           </w:p>
         </w:tc>
@@ -1679,16 +1679,8 @@
             </w:tcMar>
           </w:tcPr>
           <w:p>
-            <w:pPr>
-              <w:spacing w:after="20"/>
-            </w:pPr>
-            <w:r/>
             <w:r>
-              <w:rPr>
-                <w:b w:val="0"/>
-                <w:sz w:val="18"/>
-              </w:rPr>
-              <w:t>Cursos, audiencia por grupos o estudiantes, anuncios, actividades, entregas, comentarios, asistencia y calificaciones.</w:t>
+              <w:t>Cursos, audiencia por grupos o estudiantes, anuncios, actividades, entregas, comentarios, asistencia y calificaciones. El seguimiento por actividad presenta todo el roster con estado pendiente, atrasado, entregado o calificado, fecha de envío, búsqueda y filtro; desde la misma vista el docente califica.</w:t>
             </w:r>
           </w:p>
         </w:tc>
@@ -1705,16 +1697,8 @@
             </w:tcMar>
           </w:tcPr>
           <w:p>
-            <w:pPr>
-              <w:spacing w:after="20"/>
-            </w:pPr>
-            <w:r/>
             <w:r>
-              <w:rPr>
-                <w:b w:val="0"/>
-                <w:sz w:val="18"/>
-              </w:rPr>
-              <w:t>Rutas /api/classroom/*; reglas compartidas en server/course-access.ts; persistencia PostgreSQL.</w:t>
+              <w:t>Rutas /api/classroom/*; reglas compartidas en server/course-access.ts. El cliente combina el roster autorizado del curso y las entregas; se presenta el envío más reciente por estudiante. Sin tablas ni migraciones nuevas.</w:t>
             </w:r>
           </w:p>
         </w:tc>
@@ -3757,6 +3741,38 @@
           </w:p>
         </w:tc>
       </w:tr>
+      <w:tr>
+        <w:tc>
+          <w:tcPr>
+            <w:tcW w:type="dxa" w:w="3331"/>
+          </w:tcPr>
+          <w:p>
+            <w:r>
+              <w:t>22 de octubre de 2026</w:t>
+            </w:r>
+          </w:p>
+        </w:tc>
+        <w:tc>
+          <w:tcPr>
+            <w:tcW w:type="dxa" w:w="3331"/>
+          </w:tcPr>
+          <w:p>
+            <w:r>
+              <w:t>1.4</w:t>
+            </w:r>
+          </w:p>
+        </w:tc>
+        <w:tc>
+          <w:tcPr>
+            <w:tcW w:type="dxa" w:w="3331"/>
+          </w:tcPr>
+          <w:p>
+            <w:r>
+              <w:t>Seguimiento de actividades por estudiante: roster completo, estados de entrega, búsqueda y filtro; calificación desde la vista. Se documenta en docs/product/activity-tracking.md.</w:t>
+            </w:r>
+          </w:p>
+        </w:tc>
+      </w:tr>
     </w:tbl>
     <w:p>
       <w:pPr>

</xml_diff>

<commit_message>
feat: extend teacher gradebook and attendance history
</commit_message>
<xml_diff>
--- a/docs/official/EduNexus-Especificacion-tecnica-y-funcional.docx
+++ b/docs/official/EduNexus-Especificacion-tecnica-y-funcional.docx
@@ -137,7 +137,7 @@
           </w:tcPr>
           <w:p>
             <w:r>
-              <w:t>1.4</w:t>
+              <w:t>1.6</w:t>
             </w:r>
           </w:p>
         </w:tc>
@@ -1680,7 +1680,7 @@
           </w:tcPr>
           <w:p>
             <w:r>
-              <w:t>Cursos, audiencia por grupos o estudiantes, anuncios, actividades, entregas, comentarios, asistencia y calificaciones. El seguimiento por actividad presenta todo el roster con estado pendiente, atrasado, entregado o calificado, fecha de envío, búsqueda y filtro; desde la misma vista el docente califica.</w:t>
+              <w:t>Cursos, audiencia por grupos o estudiantes, anuncios, actividades, entregas, comentarios, asistencia y calificaciones. El seguimiento por actividad presenta todo el roster con estado pendiente, atrasado, entregado o calificado, fecha de envío, búsqueda y filtro; desde la misma vista el docente califica. Libro consolidado docente para captura individual por materia, grupo y periodo del año académico activo. Asistencia diaria e historial de los últimos 30 días con conteos de ausencias, tardanzas y excusas por estudiante.</w:t>
             </w:r>
           </w:p>
         </w:tc>
@@ -1698,7 +1698,7 @@
           </w:tcPr>
           <w:p>
             <w:r>
-              <w:t>Rutas /api/classroom/*; reglas compartidas en server/course-access.ts. El cliente combina el roster autorizado del curso y las entregas; se presenta el envío más reciente por estudiante. Sin tablas ni migraciones nuevas.</w:t>
+              <w:t>Rutas /api/classroom/*; reglas compartidas en server/course-access.ts. El cliente combina el roster autorizado del curso y las entregas; se presenta el envío más reciente por estudiante. Sin tablas ni migraciones nuevas. El endpoint /api/gradebook/teacher/workspace limita lectura y escritura a asignaciones, matrículas y periodos de la institución del docente; las modificaciones generan eventos de auditoría. GET /api/classroom/courses/:id/attendance/history limita rangos a 90 días y restringe estudiantes a sus propios registros.</w:t>
             </w:r>
           </w:p>
         </w:tc>
@@ -3773,6 +3773,70 @@
           </w:p>
         </w:tc>
       </w:tr>
+      <w:tr>
+        <w:tc>
+          <w:tcPr>
+            <w:tcW w:type="dxa" w:w="3331"/>
+          </w:tcPr>
+          <w:p>
+            <w:r>
+              <w:t>22 de octubre de 2026</w:t>
+            </w:r>
+          </w:p>
+        </w:tc>
+        <w:tc>
+          <w:tcPr>
+            <w:tcW w:type="dxa" w:w="3331"/>
+          </w:tcPr>
+          <w:p>
+            <w:r>
+              <w:t>1.5</w:t>
+            </w:r>
+          </w:p>
+        </w:tc>
+        <w:tc>
+          <w:tcPr>
+            <w:tcW w:type="dxa" w:w="3331"/>
+          </w:tcPr>
+          <w:p>
+            <w:r>
+              <w:t>Se añadió captura docente de notas consolidadas por grupo y materia asignados, periodo del año activo y matrícula vigente; se registra nota previa/nueva en audit_logs.</w:t>
+            </w:r>
+          </w:p>
+        </w:tc>
+      </w:tr>
+      <w:tr>
+        <w:tc>
+          <w:tcPr>
+            <w:tcW w:type="dxa" w:w="3331"/>
+          </w:tcPr>
+          <w:p>
+            <w:r>
+              <w:t>22 de octubre de 2026</w:t>
+            </w:r>
+          </w:p>
+        </w:tc>
+        <w:tc>
+          <w:tcPr>
+            <w:tcW w:type="dxa" w:w="3331"/>
+          </w:tcPr>
+          <w:p>
+            <w:r>
+              <w:t>1.6</w:t>
+            </w:r>
+          </w:p>
+        </w:tc>
+        <w:tc>
+          <w:tcPr>
+            <w:tcW w:type="dxa" w:w="3331"/>
+          </w:tcPr>
+          <w:p>
+            <w:r>
+              <w:t>Se agregó el resumen de historial de asistencia por estudiante para 30 días y una API con autorización por curso, institución y propietario del registro.</w:t>
+            </w:r>
+          </w:p>
+        </w:tc>
+      </w:tr>
     </w:tbl>
     <w:p>
       <w:pPr>

</xml_diff>

<commit_message>
feat: add filters to unified academic calendar
</commit_message>
<xml_diff>
--- a/docs/official/EduNexus-Especificacion-tecnica-y-funcional.docx
+++ b/docs/official/EduNexus-Especificacion-tecnica-y-funcional.docx
@@ -137,7 +137,7 @@
           </w:tcPr>
           <w:p>
             <w:r>
-              <w:t>1.6</w:t>
+              <w:t>1.7</w:t>
             </w:r>
           </w:p>
         </w:tc>
@@ -2152,16 +2152,8 @@
             </w:tcMar>
           </w:tcPr>
           <w:p>
-            <w:pPr>
-              <w:spacing w:after="20"/>
-            </w:pPr>
-            <w:r/>
             <w:r>
-              <w:rPr>
-                <w:b w:val="0"/>
-                <w:sz w:val="18"/>
-              </w:rPr>
-              <w:t>Notificaciones dentro de la aplicación, push, eventos y asesorías.</w:t>
+              <w:t>Notificaciones dentro de la aplicación, push, eventos, asesorías y agenda académica unificada. El calendario integra clases recurrentes, fechas de entrega y eventos institucionales, y permite filtrar cada tipo desde la interfaz.</w:t>
             </w:r>
           </w:p>
         </w:tc>
@@ -2178,16 +2170,8 @@
             </w:tcMar>
           </w:tcPr>
           <w:p>
-            <w:pPr>
-              <w:spacing w:after="20"/>
-            </w:pPr>
-            <w:r/>
             <w:r>
-              <w:rPr>
-                <w:b w:val="0"/>
-                <w:sz w:val="18"/>
-              </w:rPr>
-              <w:t>PostgreSQL; Web Push depende de claves VAPID; eventos y asesorías usan rutas de producto.</w:t>
+              <w:t>PostgreSQL; Web Push depende de claves VAPID. El calendario consulta /api/events, /api/classroom/my-activities y /api/admin/schedules; cada ruta conserva el ámbito institucional y aplica restricciones por rol. Los filtros son de presentación y no amplían los datos que entrega el servidor.</w:t>
             </w:r>
           </w:p>
         </w:tc>
@@ -3837,6 +3821,47 @@
           </w:p>
         </w:tc>
       </w:tr>
+      <w:tr>
+        <w:tc>
+          <w:tcPr>
+            <w:tcW w:type="dxa" w:w="3331"/>
+          </w:tcPr>
+          <w:p>
+            <w:r>
+              <w:rPr>
+                <w:sz w:val="16"/>
+              </w:rPr>
+              <w:t>22 de octubre de 2026</w:t>
+            </w:r>
+          </w:p>
+        </w:tc>
+        <w:tc>
+          <w:tcPr>
+            <w:tcW w:type="dxa" w:w="3331"/>
+          </w:tcPr>
+          <w:p>
+            <w:r>
+              <w:rPr>
+                <w:sz w:val="16"/>
+              </w:rPr>
+              <w:t>1.7</w:t>
+            </w:r>
+          </w:p>
+        </w:tc>
+        <w:tc>
+          <w:tcPr>
+            <w:tcW w:type="dxa" w:w="3331"/>
+          </w:tcPr>
+          <w:p>
+            <w:r>
+              <w:rPr>
+                <w:sz w:val="16"/>
+              </w:rPr>
+              <w:t>Se añadieron filtros independientes para eventos y asesorías, entregas y clases en el calendario integrado. Las fuentes existentes conservan autorización por institución y rol.</w:t>
+            </w:r>
+          </w:p>
+        </w:tc>
+      </w:tr>
     </w:tbl>
     <w:p>
       <w:pPr>

</xml_diff>

<commit_message>
feat: filter academic calendar by course and group
</commit_message>
<xml_diff>
--- a/docs/official/EduNexus-Especificacion-tecnica-y-funcional.docx
+++ b/docs/official/EduNexus-Especificacion-tecnica-y-funcional.docx
@@ -137,7 +137,7 @@
           </w:tcPr>
           <w:p>
             <w:r>
-              <w:t>1.7</w:t>
+              <w:t>1.8</w:t>
             </w:r>
           </w:p>
         </w:tc>
@@ -2153,7 +2153,7 @@
           </w:tcPr>
           <w:p>
             <w:r>
-              <w:t>Notificaciones dentro de la aplicación, push, eventos, asesorías y agenda académica unificada. El calendario integra clases recurrentes, fechas de entrega y eventos institucionales, y permite filtrar cada tipo desde la interfaz.</w:t>
+              <w:t>Notificaciones dentro de la aplicación, push, eventos, asesorías y agenda académica unificada. El calendario integra clases recurrentes, fechas de entrega y eventos institucionales, con filtros por tipo y filtros de curso/grupo para actividades y horarios.</w:t>
             </w:r>
           </w:p>
         </w:tc>
@@ -2171,7 +2171,7 @@
           </w:tcPr>
           <w:p>
             <w:r>
-              <w:t>PostgreSQL; Web Push depende de claves VAPID. El calendario consulta /api/events, /api/classroom/my-activities y /api/admin/schedules; cada ruta conserva el ámbito institucional y aplica restricciones por rol. Los filtros son de presentación y no amplían los datos que entrega el servidor.</w:t>
+              <w:t>PostgreSQL; Web Push depende de claves VAPID. El calendario consulta /api/events, /api/classroom/my-activities y /api/admin/schedules; cada ruta conserva el ámbito institucional y aplica restricciones por rol. Los eventos permanecen institucionales porque el modelo actual no los asocia a aulas. Los filtros son de presentación y no amplían los datos que entrega el servidor.</w:t>
             </w:r>
           </w:p>
         </w:tc>
@@ -3862,6 +3862,38 @@
           </w:p>
         </w:tc>
       </w:tr>
+      <w:tr>
+        <w:tc>
+          <w:tcPr>
+            <w:tcW w:type="dxa" w:w="3331"/>
+          </w:tcPr>
+          <w:p>
+            <w:r>
+              <w:t>22 de octubre de 2026</w:t>
+            </w:r>
+          </w:p>
+        </w:tc>
+        <w:tc>
+          <w:tcPr>
+            <w:tcW w:type="dxa" w:w="3331"/>
+          </w:tcPr>
+          <w:p>
+            <w:r>
+              <w:t>1.8</w:t>
+            </w:r>
+          </w:p>
+        </w:tc>
+        <w:tc>
+          <w:tcPr>
+            <w:tcW w:type="dxa" w:w="3331"/>
+          </w:tcPr>
+          <w:p>
+            <w:r>
+              <w:t>Se completaron filtros por tipo, curso y grupo en la agenda académica integrada. Los eventos continúan como institucionales y no se asocian a aulas.</w:t>
+            </w:r>
+          </w:p>
+        </w:tc>
+      </w:tr>
     </w:tbl>
     <w:p>
       <w:pPr>

</xml_diff>

<commit_message>
feat: track classroom announcement delivery and reads
</commit_message>
<xml_diff>
--- a/docs/official/EduNexus-Especificacion-tecnica-y-funcional.docx
+++ b/docs/official/EduNexus-Especificacion-tecnica-y-funcional.docx
@@ -137,7 +137,7 @@
           </w:tcPr>
           <w:p>
             <w:r>
-              <w:t>1.8</w:t>
+              <w:t>1.9</w:t>
             </w:r>
           </w:p>
         </w:tc>
@@ -1680,7 +1680,7 @@
           </w:tcPr>
           <w:p>
             <w:r>
-              <w:t>Cursos, audiencia por grupos o estudiantes, anuncios, actividades, entregas, comentarios, asistencia y calificaciones. El seguimiento por actividad presenta todo el roster con estado pendiente, atrasado, entregado o calificado, fecha de envío, búsqueda y filtro; desde la misma vista el docente califica. Libro consolidado docente para captura individual por materia, grupo y periodo del año académico activo. Asistencia diaria e historial de los últimos 30 días con conteos de ausencias, tardanzas y excusas por estudiante.</w:t>
+              <w:t>Cursos, audiencia por grupos o estudiantes, anuncios, actividades, entregas, comentarios, asistencia y calificaciones. El seguimiento por actividad presenta todo el roster con estado pendiente, atrasado, entregado o calificado, fecha de envío, búsqueda y filtro; desde la misma vista el docente califica. Libro consolidado docente para captura individual por materia, grupo y periodo del año académico activo. Asistencia diaria e historial de los últimos 30 días con conteos de ausencias, tardanzas y excusas por estudiante. El tablón registra destinatarios activos por publicación y marca la primera lectura de cada estudiante; el docente y personal autorizado ven el estado nominal.</w:t>
             </w:r>
           </w:p>
         </w:tc>
@@ -1698,7 +1698,7 @@
           </w:tcPr>
           <w:p>
             <w:r>
-              <w:t>Rutas /api/classroom/*; reglas compartidas en server/course-access.ts. El cliente combina el roster autorizado del curso y las entregas; se presenta el envío más reciente por estudiante. Sin tablas ni migraciones nuevas. El endpoint /api/gradebook/teacher/workspace limita lectura y escritura a asignaciones, matrículas y periodos de la institución del docente; las modificaciones generan eventos de auditoría. GET /api/classroom/courses/:id/attendance/history limita rangos a 90 días y restringe estudiantes a sus propios registros.</w:t>
+              <w:t>Rutas /api/classroom/*; reglas compartidas en server/course-access.ts. El cliente combina el roster autorizado del curso y las entregas; se presenta el envío más reciente por estudiante. Sin tablas ni migraciones nuevas. El endpoint /api/gradebook/teacher/workspace limita lectura y escritura a asignaciones, matrículas y periodos de la institución del docente; las modificaciones generan eventos de auditoría. GET /api/classroom/courses/:id/attendance/history limita rangos a 90 días y restringe estudiantes a sus propios registros. Las entregas y lecturas se guardan en course_post_recipients con unicidad por publicación y usuario. La consulta de estados nominales se limita a los roles docentes y de gestión autorizados; los estudiantes no ven la actividad de sus compañeros.</w:t>
             </w:r>
           </w:p>
         </w:tc>
@@ -3894,6 +3894,38 @@
           </w:p>
         </w:tc>
       </w:tr>
+      <w:tr>
+        <w:tc>
+          <w:tcPr>
+            <w:tcW w:type="dxa" w:w="3331"/>
+          </w:tcPr>
+          <w:p>
+            <w:r>
+              <w:t>22 de octubre de 2026</w:t>
+            </w:r>
+          </w:p>
+        </w:tc>
+        <w:tc>
+          <w:tcPr>
+            <w:tcW w:type="dxa" w:w="3331"/>
+          </w:tcPr>
+          <w:p>
+            <w:r>
+              <w:t>1.9</w:t>
+            </w:r>
+          </w:p>
+        </w:tc>
+        <w:tc>
+          <w:tcPr>
+            <w:tcW w:type="dxa" w:w="3331"/>
+          </w:tcPr>
+          <w:p>
+            <w:r>
+              <w:t>Se añadió seguimiento nominal de destinatarios y primera lectura en anuncios de aula con permisos por curso e institución.</w:t>
+            </w:r>
+          </w:p>
+        </w:tc>
+      </w:tr>
     </w:tbl>
     <w:p>
       <w:pPr>

</xml_diff>

<commit_message>
feat: add role-aware help center and teacher guide
</commit_message>
<xml_diff>
--- a/docs/official/EduNexus-Especificacion-tecnica-y-funcional.docx
+++ b/docs/official/EduNexus-Especificacion-tecnica-y-funcional.docx
@@ -137,7 +137,7 @@
           </w:tcPr>
           <w:p>
             <w:r>
-              <w:t>1.9</w:t>
+              <w:t>2.0</w:t>
             </w:r>
           </w:p>
         </w:tc>
@@ -2261,6 +2261,38 @@
           </w:p>
         </w:tc>
       </w:tr>
+      <w:tr>
+        <w:tc>
+          <w:tcPr>
+            <w:tcW w:type="dxa" w:w="3331"/>
+          </w:tcPr>
+          <w:p>
+            <w:r>
+              <w:t>Centro de ayuda y orientación</w:t>
+            </w:r>
+          </w:p>
+        </w:tc>
+        <w:tc>
+          <w:tcPr>
+            <w:tcW w:type="dxa" w:w="3331"/>
+          </w:tcPr>
+          <w:p>
+            <w:r>
+              <w:t>Preguntas frecuentes buscables y filtradas por perfil; guía inicial docente con accesos a aulas, actividades, revisión de entregas y calendario.</w:t>
+            </w:r>
+          </w:p>
+        </w:tc>
+        <w:tc>
+          <w:tcPr>
+            <w:tcW w:type="dxa" w:w="3331"/>
+          </w:tcPr>
+          <w:p>
+            <w:r>
+              <w:t>Ruta autenticada /help en client/src/pages/HelpCenter.tsx. El contenido no expone datos académicos ni concede permisos; los enlaces conservan los controles del módulo destino.</w:t>
+            </w:r>
+          </w:p>
+        </w:tc>
+      </w:tr>
     </w:tbl>
     <w:p>
       <w:pPr>
@@ -3926,6 +3958,38 @@
           </w:p>
         </w:tc>
       </w:tr>
+      <w:tr>
+        <w:tc>
+          <w:tcPr>
+            <w:tcW w:type="dxa" w:w="3331"/>
+          </w:tcPr>
+          <w:p>
+            <w:r>
+              <w:t>22 de octubre de 2026</w:t>
+            </w:r>
+          </w:p>
+        </w:tc>
+        <w:tc>
+          <w:tcPr>
+            <w:tcW w:type="dxa" w:w="3331"/>
+          </w:tcPr>
+          <w:p>
+            <w:r>
+              <w:t>2.0</w:t>
+            </w:r>
+          </w:p>
+        </w:tc>
+        <w:tc>
+          <w:tcPr>
+            <w:tcW w:type="dxa" w:w="3331"/>
+          </w:tcPr>
+          <w:p>
+            <w:r>
+              <w:t>Se agregó el centro de ayuda con búsqueda de FAQ por rol y una guía inicial para docentes.</w:t>
+            </w:r>
+          </w:p>
+        </w:tc>
+      </w:tr>
     </w:tbl>
     <w:p>
       <w:pPr>

</xml_diff>